<commit_message>
Update Calc 1 Blended 4.7 Optimization worksheet and solutions
Co-Authored-By: Claude Sonnet 5.5 <noreply@anthropic.com>
</commit_message>
<xml_diff>
--- a/Course Materials/Calc 1/Blended Sessions/Unit 3/4.7 Optimization.docx
+++ b/Course Materials/Calc 1/Blended Sessions/Unit 3/4.7 Optimization.docx
@@ -282,10 +282,10 @@
             <v:path o:extrusionok="f" gradientshapeok="t" o:connecttype="rect"/>
             <o:lock v:ext="edit" aspectratio="t"/>
           </v:shapetype>
-          <v:shape id="_x0000_i1025" type="#_x0000_t75" style="width:27.75pt;height:14.25pt" o:ole="">
+          <v:shape id="_x0000_i1025" type="#_x0000_t75" style="width:27.55pt;height:14.1pt" o:ole="">
             <v:imagedata r:id="rId8" o:title=""/>
           </v:shape>
-          <o:OLEObject Type="Embed" ProgID="Equation.DSMT4" ShapeID="_x0000_i1025" DrawAspect="Content" ObjectID="_1845003978" r:id="rId9"/>
+          <o:OLEObject Type="Embed" ProgID="Equation.DSMT4" ShapeID="_x0000_i1025" DrawAspect="Content" ObjectID="_1854630783" r:id="rId9"/>
         </w:object>
       </w:r>
       <w:r>
@@ -484,10 +484,10 @@
           <w:position w:val="-6"/>
         </w:rPr>
         <w:object w:dxaOrig="560" w:dyaOrig="279" w14:anchorId="22BFD758">
-          <v:shape id="_x0000_i1026" type="#_x0000_t75" style="width:27.75pt;height:14.25pt" o:ole="">
+          <v:shape id="_x0000_i1026" type="#_x0000_t75" style="width:27.55pt;height:14.1pt" o:ole="">
             <v:imagedata r:id="rId10" o:title=""/>
           </v:shape>
-          <o:OLEObject Type="Embed" ProgID="Equation.DSMT4" ShapeID="_x0000_i1026" DrawAspect="Content" ObjectID="_1845003979" r:id="rId11"/>
+          <o:OLEObject Type="Embed" ProgID="Equation.DSMT4" ShapeID="_x0000_i1026" DrawAspect="Content" ObjectID="_1854630784" r:id="rId11"/>
         </w:object>
       </w:r>
       <w:r>
@@ -501,10 +501,10 @@
           <w:position w:val="-14"/>
         </w:rPr>
         <w:object w:dxaOrig="1240" w:dyaOrig="400" w14:anchorId="34B51693">
-          <v:shape id="_x0000_i1027" type="#_x0000_t75" style="width:62.25pt;height:20.25pt" o:ole="">
+          <v:shape id="_x0000_i1027" type="#_x0000_t75" style="width:62.1pt;height:20.45pt" o:ole="">
             <v:imagedata r:id="rId12" o:title=""/>
           </v:shape>
-          <o:OLEObject Type="Embed" ProgID="Equation.DSMT4" ShapeID="_x0000_i1027" DrawAspect="Content" ObjectID="_1845003980" r:id="rId13"/>
+          <o:OLEObject Type="Embed" ProgID="Equation.DSMT4" ShapeID="_x0000_i1027" DrawAspect="Content" ObjectID="_1854630785" r:id="rId13"/>
         </w:object>
       </w:r>
       <w:r>
@@ -518,10 +518,10 @@
           <w:position w:val="-14"/>
         </w:rPr>
         <w:object w:dxaOrig="980" w:dyaOrig="400" w14:anchorId="222FC372">
-          <v:shape id="_x0000_i1028" type="#_x0000_t75" style="width:48.75pt;height:20.25pt" o:ole="">
+          <v:shape id="_x0000_i1028" type="#_x0000_t75" style="width:48.7pt;height:20.45pt" o:ole="">
             <v:imagedata r:id="rId14" o:title=""/>
           </v:shape>
-          <o:OLEObject Type="Embed" ProgID="Equation.DSMT4" ShapeID="_x0000_i1028" DrawAspect="Content" ObjectID="_1845003981" r:id="rId15"/>
+          <o:OLEObject Type="Embed" ProgID="Equation.DSMT4" ShapeID="_x0000_i1028" DrawAspect="Content" ObjectID="_1854630786" r:id="rId15"/>
         </w:object>
       </w:r>
       <w:r>
@@ -535,10 +535,10 @@
           <w:position w:val="-24"/>
         </w:rPr>
         <w:object w:dxaOrig="1860" w:dyaOrig="620" w14:anchorId="1D69AF2D">
-          <v:shape id="_x0000_i1029" type="#_x0000_t75" style="width:93pt;height:30.75pt" o:ole="">
+          <v:shape id="_x0000_i1029" type="#_x0000_t75" style="width:93.2pt;height:31.05pt" o:ole="">
             <v:imagedata r:id="rId16" o:title=""/>
           </v:shape>
-          <o:OLEObject Type="Embed" ProgID="Equation.DSMT4" ShapeID="_x0000_i1029" DrawAspect="Content" ObjectID="_1845003982" r:id="rId17"/>
+          <o:OLEObject Type="Embed" ProgID="Equation.DSMT4" ShapeID="_x0000_i1029" DrawAspect="Content" ObjectID="_1854630787" r:id="rId17"/>
         </w:object>
       </w:r>
       <w:r>
@@ -789,10 +789,10 @@
           <w:position w:val="-24"/>
         </w:rPr>
         <w:object w:dxaOrig="3040" w:dyaOrig="780" w14:anchorId="1E0C0A52">
-          <v:shape id="_x0000_i1030" type="#_x0000_t75" style="width:152.25pt;height:39pt" o:ole="">
+          <v:shape id="_x0000_i1030" type="#_x0000_t75" style="width:152.45pt;height:38.8pt" o:ole="">
             <v:imagedata r:id="rId19" o:title=""/>
           </v:shape>
-          <o:OLEObject Type="Embed" ProgID="Equation.DSMT4" ShapeID="_x0000_i1030" DrawAspect="Content" ObjectID="_1845003983" r:id="rId20"/>
+          <o:OLEObject Type="Embed" ProgID="Equation.DSMT4" ShapeID="_x0000_i1030" DrawAspect="Content" ObjectID="_1854630788" r:id="rId20"/>
         </w:object>
       </w:r>
     </w:p>
@@ -1110,14 +1110,12 @@
         <w:lastRenderedPageBreak/>
         <w:t xml:space="preserve">A cone-shaped drinking cup is made from a </w:t>
       </w:r>
-      <w:proofErr w:type="spellStart"/>
       <w:r>
         <w:rPr>
           <w:szCs w:val="24"/>
         </w:rPr>
-        <w:t>cicular</w:t>
+        <w:t>circular</w:t>
       </w:r>
-      <w:proofErr w:type="spellEnd"/>
       <w:r>
         <w:rPr>
           <w:szCs w:val="24"/>
@@ -1172,10 +1170,10 @@
           <w:szCs w:val="24"/>
         </w:rPr>
         <w:object w:dxaOrig="200" w:dyaOrig="279" w14:anchorId="328B58B3">
-          <v:shape id="_x0000_i1031" type="#_x0000_t75" style="width:9.75pt;height:14.25pt" o:ole="">
+          <v:shape id="_x0000_i1031" type="#_x0000_t75" style="width:9.9pt;height:14.1pt" o:ole="">
             <v:imagedata r:id="rId21" o:title=""/>
           </v:shape>
-          <o:OLEObject Type="Embed" ProgID="Equation.DSMT4" ShapeID="_x0000_i1031" DrawAspect="Content" ObjectID="_1845003984" r:id="rId22"/>
+          <o:OLEObject Type="Embed" ProgID="Equation.DSMT4" ShapeID="_x0000_i1031" DrawAspect="Content" ObjectID="_1854630789" r:id="rId22"/>
         </w:object>
       </w:r>
       <w:r>
@@ -1317,10 +1315,10 @@
                                   <w:position w:val="-6"/>
                                 </w:rPr>
                                 <w:object w:dxaOrig="200" w:dyaOrig="279" w14:anchorId="26D69A14">
-                                  <v:shape id="_x0000_i1054" type="#_x0000_t75" style="width:9.75pt;height:14.25pt" o:ole="">
+                                  <v:shape id="_x0000_i1033" type="#_x0000_t75" style="width:9.9pt;height:14.1pt" o:ole="">
                                     <v:imagedata r:id="rId25" o:title=""/>
                                   </v:shape>
-                                  <o:OLEObject Type="Embed" ProgID="Equation.DSMT4" ShapeID="_x0000_i1054" DrawAspect="Content" ObjectID="_1845003985" r:id="rId26"/>
+                                  <o:OLEObject Type="Embed" ProgID="Equation.DSMT4" ShapeID="_x0000_i1033" DrawAspect="Content" ObjectID="_1854630790" r:id="rId26"/>
                                 </w:object>
                               </w:r>
                             </w:p>
@@ -1364,9 +1362,9 @@
                           </w:rPr>
                           <w:object w:dxaOrig="200" w:dyaOrig="279" w14:anchorId="26D69A14">
                             <v:shape id="_x0000_i1054" type="#_x0000_t75" style="width:9.75pt;height:14.25pt" o:ole="">
-                              <v:imagedata r:id="rId25" o:title=""/>
+                              <v:imagedata r:id="rId29" o:title=""/>
                             </v:shape>
-                            <o:OLEObject Type="Embed" ProgID="Equation.DSMT4" ShapeID="_x0000_i1054" DrawAspect="Content" ObjectID="_1845003985" r:id="rId29"/>
+                            <o:OLEObject Type="Embed" ProgID="Equation.DSMT4" ShapeID="_x0000_i1054" DrawAspect="Content" ObjectID="_1845003985" r:id="rId30"/>
                           </w:object>
                         </w:r>
                       </w:p>
@@ -1388,12 +1386,12 @@
       </w:pPr>
     </w:p>
     <w:sectPr>
-      <w:headerReference w:type="even" r:id="rId30"/>
-      <w:headerReference w:type="default" r:id="rId31"/>
-      <w:footerReference w:type="even" r:id="rId32"/>
-      <w:footerReference w:type="default" r:id="rId33"/>
-      <w:headerReference w:type="first" r:id="rId34"/>
-      <w:footerReference w:type="first" r:id="rId35"/>
+      <w:headerReference w:type="even" r:id="rId31"/>
+      <w:headerReference w:type="default" r:id="rId32"/>
+      <w:footerReference w:type="even" r:id="rId33"/>
+      <w:footerReference w:type="default" r:id="rId34"/>
+      <w:headerReference w:type="first" r:id="rId35"/>
+      <w:footerReference w:type="first" r:id="rId36"/>
       <w:pgSz w:w="12240" w:h="15840"/>
       <w:pgMar w:top="720" w:right="720" w:bottom="720" w:left="720" w:header="576" w:footer="720" w:gutter="0"/>
       <w:cols w:space="720"/>

</xml_diff>